<commit_message>
Update SubScription Traking App(STArt ).docx
</commit_message>
<xml_diff>
--- a/SubScription Traking App(STArt ).docx
+++ b/SubScription Traking App(STArt ).docx
@@ -1,6 +1,6 @@
 
 <file path=word/document.xml><?xml version="1.0" encoding="utf-8"?>
-<w:document xmlns:wpc="http://schemas.microsoft.com/office/word/2010/wordprocessingCanvas" xmlns:cx="http://schemas.microsoft.com/office/drawing/2014/chartex" xmlns:mc="http://schemas.openxmlformats.org/markup-compatibility/2006" xmlns:o="urn:schemas-microsoft-com:office:office" xmlns:r="http://schemas.openxmlformats.org/officeDocument/2006/relationships" xmlns:m="http://schemas.openxmlformats.org/officeDocument/2006/math" xmlns:v="urn:schemas-microsoft-com:vml" xmlns:wp14="http://schemas.microsoft.com/office/word/2010/wordprocessingDrawing" xmlns:wp="http://schemas.openxmlformats.org/drawingml/2006/wordprocessingDrawing" xmlns:w10="urn:schemas-microsoft-com:office:word" xmlns:w="http://schemas.openxmlformats.org/wordprocessingml/2006/main" xmlns:w14="http://schemas.microsoft.com/office/word/2010/wordml" xmlns:w15="http://schemas.microsoft.com/office/word/2012/wordml" xmlns:w16se="http://schemas.microsoft.com/office/word/2015/wordml/symex" xmlns:wpg="http://schemas.microsoft.com/office/word/2010/wordprocessingGroup" xmlns:wpi="http://schemas.microsoft.com/office/word/2010/wordprocessingInk" xmlns:wne="http://schemas.microsoft.com/office/word/2006/wordml" xmlns:wps="http://schemas.microsoft.com/office/word/2010/wordprocessingShape" mc:Ignorable="w14 w15 w16se wp14">
+<w:document xmlns:wpc="http://schemas.microsoft.com/office/word/2010/wordprocessingCanvas" xmlns:cx="http://schemas.microsoft.com/office/drawing/2014/chartex" xmlns:cx1="http://schemas.microsoft.com/office/drawing/2015/9/8/chartex" xmlns:cx2="http://schemas.microsoft.com/office/drawing/2015/10/21/chartex" xmlns:cx3="http://schemas.microsoft.com/office/drawing/2016/5/9/chartex" xmlns:cx4="http://schemas.microsoft.com/office/drawing/2016/5/10/chartex" xmlns:cx5="http://schemas.microsoft.com/office/drawing/2016/5/11/chartex" xmlns:cx6="http://schemas.microsoft.com/office/drawing/2016/5/12/chartex" xmlns:cx7="http://schemas.microsoft.com/office/drawing/2016/5/13/chartex" xmlns:cx8="http://schemas.microsoft.com/office/drawing/2016/5/14/chartex" xmlns:mc="http://schemas.openxmlformats.org/markup-compatibility/2006" xmlns:aink="http://schemas.microsoft.com/office/drawing/2016/ink" xmlns:am3d="http://schemas.microsoft.com/office/drawing/2017/model3d" xmlns:o="urn:schemas-microsoft-com:office:office" xmlns:oel="http://schemas.microsoft.com/office/2019/extlst" xmlns:r="http://schemas.openxmlformats.org/officeDocument/2006/relationships" xmlns:m="http://schemas.openxmlformats.org/officeDocument/2006/math" xmlns:v="urn:schemas-microsoft-com:vml" xmlns:wp14="http://schemas.microsoft.com/office/word/2010/wordprocessingDrawing" xmlns:wp="http://schemas.openxmlformats.org/drawingml/2006/wordprocessingDrawing" xmlns:w10="urn:schemas-microsoft-com:office:word" xmlns:w="http://schemas.openxmlformats.org/wordprocessingml/2006/main" xmlns:w14="http://schemas.microsoft.com/office/word/2010/wordml" xmlns:w15="http://schemas.microsoft.com/office/word/2012/wordml" xmlns:w16cei="http://schemas.microsoft.com/office/word/2026/wordml/cei" xmlns:w16cex="http://schemas.microsoft.com/office/word/2018/wordml/cex" xmlns:w16cid="http://schemas.microsoft.com/office/word/2016/wordml/cid" xmlns:w16="http://schemas.microsoft.com/office/word/2018/wordml" xmlns:w16du="http://schemas.microsoft.com/office/word/2023/wordml/word16du" xmlns:w16sdtdh="http://schemas.microsoft.com/office/word/2020/wordml/sdtdatahash" xmlns:w16sdtfl="http://schemas.microsoft.com/office/word/2024/wordml/sdtformatlock" xmlns:w16se="http://schemas.microsoft.com/office/word/2015/wordml/symex" xmlns:wpg="http://schemas.microsoft.com/office/word/2010/wordprocessingGroup" xmlns:wpi="http://schemas.microsoft.com/office/word/2010/wordprocessingInk" xmlns:wne="http://schemas.microsoft.com/office/word/2006/wordml" xmlns:wps="http://schemas.microsoft.com/office/word/2010/wordprocessingShape" mc:Ignorable="w14 w15 w16se w16cid w16 w16cex w16sdtdh w16sdtfl w16du wp14">
   <w:body>
     <w:p>
       <w:pPr>
@@ -57,7 +57,7 @@
           <w:noProof/>
         </w:rPr>
         <w:drawing>
-          <wp:inline distT="0" distB="0" distL="0" distR="0" wp14:anchorId="02087189" wp14:editId="19F2D5ED">
+          <wp:inline distT="0" distB="0" distL="0" distR="0" wp14:anchorId="02087189" wp14:editId="5D05EA1B">
             <wp:extent cx="5731510" cy="3126105"/>
             <wp:effectExtent l="0" t="0" r="2540" b="0"/>
             <wp:docPr id="2" name="Picture 2"/>
@@ -98,11 +98,24 @@
           </wp:inline>
         </w:drawing>
       </w:r>
-      <w:bookmarkStart w:id="0" w:name="_GoBack"/>
-      <w:bookmarkEnd w:id="0"/>
     </w:p>
     <w:p>
       <w:pPr>
+        <w:rPr>
+          <w:rFonts w:ascii="Berlin Sans FB Demi" w:hAnsi="Berlin Sans FB Demi"/>
+          <w:caps/>
+          <w:spacing w:val="15"/>
+        </w:rPr>
+      </w:pPr>
+      <w:r>
+        <w:rPr>
+          <w:rFonts w:ascii="Berlin Sans FB Demi" w:hAnsi="Berlin Sans FB Demi"/>
+        </w:rPr>
+        <w:br w:type="page"/>
+      </w:r>
+    </w:p>
+    <w:p>
+      <w:pPr>
         <w:pStyle w:val="Heading2"/>
         <w:rPr>
           <w:rFonts w:ascii="Berlin Sans FB Demi" w:hAnsi="Berlin Sans FB Demi"/>
@@ -112,6 +125,7 @@
         <w:rPr>
           <w:rFonts w:ascii="Berlin Sans FB Demi" w:hAnsi="Berlin Sans FB Demi"/>
         </w:rPr>
+        <w:lastRenderedPageBreak/>
         <w:t>1. Defining the Platform: Mobile vs. Web</w:t>
       </w:r>
     </w:p>
@@ -146,25 +160,7 @@
           <w:b/>
           <w:bCs/>
         </w:rPr>
-        <w:t>Native Mobile App (Android/</w:t>
-      </w:r>
-      <w:proofErr w:type="spellStart"/>
-      <w:r>
-        <w:rPr>
-          <w:rFonts w:ascii="Berlin Sans FB Demi" w:hAnsi="Berlin Sans FB Demi"/>
-          <w:b/>
-          <w:bCs/>
-        </w:rPr>
-        <w:t>Kotlin</w:t>
-      </w:r>
-      <w:proofErr w:type="spellEnd"/>
-      <w:r>
-        <w:rPr>
-          <w:rFonts w:ascii="Berlin Sans FB Demi" w:hAnsi="Berlin Sans FB Demi"/>
-          <w:b/>
-          <w:bCs/>
-        </w:rPr>
-        <w:t>):</w:t>
+        <w:t>Native Mobile App (Android/Kotlin):</w:t>
       </w:r>
       <w:r>
         <w:rPr>
@@ -201,6 +197,21 @@
     </w:p>
     <w:p>
       <w:pPr>
+        <w:rPr>
+          <w:rFonts w:ascii="Berlin Sans FB Demi" w:hAnsi="Berlin Sans FB Demi"/>
+          <w:caps/>
+          <w:spacing w:val="15"/>
+        </w:rPr>
+      </w:pPr>
+      <w:r>
+        <w:rPr>
+          <w:rFonts w:ascii="Berlin Sans FB Demi" w:hAnsi="Berlin Sans FB Demi"/>
+        </w:rPr>
+        <w:br w:type="page"/>
+      </w:r>
+    </w:p>
+    <w:p>
+      <w:pPr>
         <w:pStyle w:val="Heading2"/>
         <w:rPr>
           <w:rFonts w:ascii="Berlin Sans FB Demi" w:hAnsi="Berlin Sans FB Demi"/>
@@ -210,6 +221,7 @@
         <w:rPr>
           <w:rFonts w:ascii="Berlin Sans FB Demi" w:hAnsi="Berlin Sans FB Demi"/>
         </w:rPr>
+        <w:lastRenderedPageBreak/>
         <w:t>2. Core Functionalities (The "Must-Haves")</w:t>
       </w:r>
     </w:p>
@@ -342,7 +354,6 @@
         <w:rPr>
           <w:rFonts w:ascii="Berlin Sans FB Demi" w:hAnsi="Berlin Sans FB Demi"/>
         </w:rPr>
-        <w:lastRenderedPageBreak/>
         <w:t>3. Advanced Functionalities (The "Nice-to-Haves")</w:t>
       </w:r>
     </w:p>
@@ -492,6 +503,21 @@
     </w:p>
     <w:p>
       <w:pPr>
+        <w:rPr>
+          <w:rFonts w:ascii="Berlin Sans FB Demi" w:hAnsi="Berlin Sans FB Demi"/>
+          <w:caps/>
+          <w:spacing w:val="15"/>
+        </w:rPr>
+      </w:pPr>
+      <w:r>
+        <w:rPr>
+          <w:rFonts w:ascii="Berlin Sans FB Demi" w:hAnsi="Berlin Sans FB Demi"/>
+        </w:rPr>
+        <w:br w:type="page"/>
+      </w:r>
+    </w:p>
+    <w:p>
+      <w:pPr>
         <w:pStyle w:val="Heading2"/>
         <w:rPr>
           <w:rFonts w:ascii="Berlin Sans FB Demi" w:hAnsi="Berlin Sans FB Demi"/>
@@ -501,6 +527,7 @@
         <w:rPr>
           <w:rFonts w:ascii="Berlin Sans FB Demi" w:hAnsi="Berlin Sans FB Demi"/>
         </w:rPr>
+        <w:lastRenderedPageBreak/>
         <w:t>4. Technology Stack Recommendations</w:t>
       </w:r>
     </w:p>
@@ -707,14 +734,12 @@
                 <w:rFonts w:ascii="Berlin Sans FB Demi" w:hAnsi="Berlin Sans FB Demi"/>
               </w:rPr>
             </w:pPr>
-            <w:proofErr w:type="spellStart"/>
             <w:r>
               <w:rPr>
                 <w:rFonts w:ascii="Berlin Sans FB Demi" w:hAnsi="Berlin Sans FB Demi"/>
               </w:rPr>
               <w:t>Kotlin</w:t>
             </w:r>
-            <w:proofErr w:type="spellEnd"/>
           </w:p>
         </w:tc>
         <w:tc>
@@ -746,16 +771,8 @@
               <w:rPr>
                 <w:rFonts w:ascii="Berlin Sans FB Demi" w:hAnsi="Berlin Sans FB Demi"/>
               </w:rPr>
-              <w:t xml:space="preserve">JavaScript / </w:t>
+              <w:t>JavaScript / TypeScript</w:t>
             </w:r>
-            <w:proofErr w:type="spellStart"/>
-            <w:r>
-              <w:rPr>
-                <w:rFonts w:ascii="Berlin Sans FB Demi" w:hAnsi="Berlin Sans FB Demi"/>
-              </w:rPr>
-              <w:t>TypeScript</w:t>
-            </w:r>
-            <w:proofErr w:type="spellEnd"/>
           </w:p>
         </w:tc>
       </w:tr>
@@ -1256,7 +1273,6 @@
                 <w:b/>
                 <w:bCs/>
               </w:rPr>
-              <w:lastRenderedPageBreak/>
               <w:t>Deployment / Hosting</w:t>
             </w:r>
           </w:p>
@@ -1331,21 +1347,7 @@
               <w:rPr>
                 <w:rFonts w:ascii="Berlin Sans FB Demi" w:hAnsi="Berlin Sans FB Demi"/>
               </w:rPr>
-              <w:t xml:space="preserve"> or </w:t>
-            </w:r>
-            <w:proofErr w:type="spellStart"/>
-            <w:r>
-              <w:rPr>
-                <w:rFonts w:ascii="Berlin Sans FB Demi" w:hAnsi="Berlin Sans FB Demi"/>
-              </w:rPr>
-              <w:t>Netlify</w:t>
-            </w:r>
-            <w:proofErr w:type="spellEnd"/>
-            <w:r>
-              <w:rPr>
-                <w:rFonts w:ascii="Berlin Sans FB Demi" w:hAnsi="Berlin Sans FB Demi"/>
-              </w:rPr>
-              <w:t xml:space="preserve"> (GitHub integrated)</w:t>
+              <w:t xml:space="preserve"> or Netlify (GitHub integrated)</w:t>
             </w:r>
           </w:p>
         </w:tc>
@@ -1358,39 +1360,35 @@
           <w:rFonts w:ascii="Berlin Sans FB Demi" w:hAnsi="Berlin Sans FB Demi"/>
         </w:rPr>
       </w:pPr>
-      <w:r>
-        <w:rPr>
-          <w:rFonts w:ascii="Berlin Sans FB Demi" w:hAnsi="Berlin Sans FB Demi"/>
-        </w:rPr>
-        <w:t>5. Research &amp; Preparation Phase</w:t>
-      </w:r>
     </w:p>
     <w:p>
       <w:pPr>
-        <w:pStyle w:val="NormalWeb"/>
-        <w:rPr>
-          <w:rFonts w:ascii="Berlin Sans FB Demi" w:hAnsi="Berlin Sans FB Demi"/>
-        </w:rPr>
-      </w:pPr>
-      <w:r>
-        <w:rPr>
-          <w:rFonts w:ascii="Berlin Sans FB Demi" w:hAnsi="Berlin Sans FB Demi"/>
-        </w:rPr>
-        <w:t>Before writing a single line of code, spend the first 1-2 weeks on project preparation.</w:t>
+        <w:rPr>
+          <w:rFonts w:ascii="Berlin Sans FB Demi" w:hAnsi="Berlin Sans FB Demi"/>
+          <w:caps/>
+          <w:spacing w:val="15"/>
+        </w:rPr>
+      </w:pPr>
+      <w:r>
+        <w:rPr>
+          <w:rFonts w:ascii="Berlin Sans FB Demi" w:hAnsi="Berlin Sans FB Demi"/>
+        </w:rPr>
+        <w:br w:type="page"/>
       </w:r>
     </w:p>
     <w:p>
       <w:pPr>
-        <w:pStyle w:val="Heading3"/>
-        <w:rPr>
-          <w:rFonts w:ascii="Berlin Sans FB Demi" w:hAnsi="Berlin Sans FB Demi"/>
-        </w:rPr>
-      </w:pPr>
-      <w:r>
-        <w:rPr>
-          <w:rFonts w:ascii="Berlin Sans FB Demi" w:hAnsi="Berlin Sans FB Demi"/>
-        </w:rPr>
-        <w:t>Step 1: Competitor Research</w:t>
+        <w:pStyle w:val="Heading2"/>
+        <w:rPr>
+          <w:rFonts w:ascii="Berlin Sans FB Demi" w:hAnsi="Berlin Sans FB Demi"/>
+        </w:rPr>
+      </w:pPr>
+      <w:r>
+        <w:rPr>
+          <w:rFonts w:ascii="Berlin Sans FB Demi" w:hAnsi="Berlin Sans FB Demi"/>
+        </w:rPr>
+        <w:lastRenderedPageBreak/>
+        <w:t>5. Research &amp; Preparation Phase</w:t>
       </w:r>
     </w:p>
     <w:p>
@@ -1404,6 +1402,34 @@
         <w:rPr>
           <w:rFonts w:ascii="Berlin Sans FB Demi" w:hAnsi="Berlin Sans FB Demi"/>
         </w:rPr>
+        <w:t>Before writing a single line of code, spend the first 1-2 weeks on project preparation.</w:t>
+      </w:r>
+    </w:p>
+    <w:p>
+      <w:pPr>
+        <w:pStyle w:val="Heading3"/>
+        <w:rPr>
+          <w:rFonts w:ascii="Berlin Sans FB Demi" w:hAnsi="Berlin Sans FB Demi"/>
+        </w:rPr>
+      </w:pPr>
+      <w:r>
+        <w:rPr>
+          <w:rFonts w:ascii="Berlin Sans FB Demi" w:hAnsi="Berlin Sans FB Demi"/>
+        </w:rPr>
+        <w:t>Step 1: Competitor Research</w:t>
+      </w:r>
+    </w:p>
+    <w:p>
+      <w:pPr>
+        <w:pStyle w:val="NormalWeb"/>
+        <w:rPr>
+          <w:rFonts w:ascii="Berlin Sans FB Demi" w:hAnsi="Berlin Sans FB Demi"/>
+        </w:rPr>
+      </w:pPr>
+      <w:r>
+        <w:rPr>
+          <w:rFonts w:ascii="Berlin Sans FB Demi" w:hAnsi="Berlin Sans FB Demi"/>
+        </w:rPr>
         <w:t xml:space="preserve">Download apps like </w:t>
       </w:r>
       <w:r>
@@ -1462,16 +1488,8 @@
         <w:rPr>
           <w:rFonts w:ascii="Berlin Sans FB Demi" w:hAnsi="Berlin Sans FB Demi"/>
         </w:rPr>
-        <w:t xml:space="preserve">Step 2: UI/UX </w:t>
-      </w:r>
-      <w:proofErr w:type="spellStart"/>
-      <w:r>
-        <w:rPr>
-          <w:rFonts w:ascii="Berlin Sans FB Demi" w:hAnsi="Berlin Sans FB Demi"/>
-        </w:rPr>
-        <w:t>Wireframing</w:t>
-      </w:r>
-      <w:proofErr w:type="spellEnd"/>
+        <w:t>Step 2: UI/UX Wireframing</w:t>
+      </w:r>
     </w:p>
     <w:p>
       <w:pPr>
@@ -1484,21 +1502,7 @@
         <w:rPr>
           <w:rFonts w:ascii="Berlin Sans FB Demi" w:hAnsi="Berlin Sans FB Demi"/>
         </w:rPr>
-        <w:t xml:space="preserve">Use a free collaborative tool like </w:t>
-      </w:r>
-      <w:proofErr w:type="spellStart"/>
-      <w:r>
-        <w:rPr>
-          <w:rFonts w:ascii="Berlin Sans FB Demi" w:hAnsi="Berlin Sans FB Demi"/>
-        </w:rPr>
-        <w:t>Figma</w:t>
-      </w:r>
-      <w:proofErr w:type="spellEnd"/>
-      <w:r>
-        <w:rPr>
-          <w:rFonts w:ascii="Berlin Sans FB Demi" w:hAnsi="Berlin Sans FB Demi"/>
-        </w:rPr>
-        <w:t xml:space="preserve"> (or pen and paper) to sketch your screens. Ensure you have wireframes for the Home Dashboard, the Add/Edit form, and the Settings page.</w:t>
+        <w:t>Use a free collaborative tool like Figma (or pen and paper) to sketch your screens. Ensure you have wireframes for the Home Dashboard, the Add/Edit form, and the Settings page.</w:t>
       </w:r>
     </w:p>
     <w:p>
@@ -1954,30 +1958,32 @@
     </w:p>
     <w:p>
       <w:pPr>
-        <w:pStyle w:val="Heading2"/>
-        <w:rPr>
-          <w:rFonts w:ascii="Berlin Sans FB Demi" w:hAnsi="Berlin Sans FB Demi"/>
-        </w:rPr>
-      </w:pPr>
-      <w:r>
-        <w:rPr>
-          <w:rFonts w:ascii="Berlin Sans FB Demi" w:hAnsi="Berlin Sans FB Demi"/>
-        </w:rPr>
-        <w:t>6. AI Prompting Strategy</w:t>
+        <w:rPr>
+          <w:rFonts w:ascii="Berlin Sans FB Demi" w:hAnsi="Berlin Sans FB Demi"/>
+          <w:caps/>
+          <w:spacing w:val="15"/>
+        </w:rPr>
+      </w:pPr>
+      <w:r>
+        <w:rPr>
+          <w:rFonts w:ascii="Berlin Sans FB Demi" w:hAnsi="Berlin Sans FB Demi"/>
+        </w:rPr>
+        <w:br w:type="page"/>
       </w:r>
     </w:p>
     <w:p>
       <w:pPr>
-        <w:pStyle w:val="NormalWeb"/>
-        <w:rPr>
-          <w:rFonts w:ascii="Berlin Sans FB Demi" w:hAnsi="Berlin Sans FB Demi"/>
-        </w:rPr>
-      </w:pPr>
-      <w:r>
-        <w:rPr>
-          <w:rFonts w:ascii="Berlin Sans FB Demi" w:hAnsi="Berlin Sans FB Demi"/>
-        </w:rPr>
-        <w:t>When you start building, use AI as your pair programmer. Instead of asking it to "build a subscription app," ask it to build specific, modular components.</w:t>
+        <w:pStyle w:val="Heading2"/>
+        <w:rPr>
+          <w:rFonts w:ascii="Berlin Sans FB Demi" w:hAnsi="Berlin Sans FB Demi"/>
+        </w:rPr>
+      </w:pPr>
+      <w:r>
+        <w:rPr>
+          <w:rFonts w:ascii="Berlin Sans FB Demi" w:hAnsi="Berlin Sans FB Demi"/>
+        </w:rPr>
+        <w:lastRenderedPageBreak/>
+        <w:t>6. AI Prompting Strategy</w:t>
       </w:r>
     </w:p>
     <w:p>
@@ -1990,6 +1996,20 @@
       <w:r>
         <w:rPr>
           <w:rFonts w:ascii="Berlin Sans FB Demi" w:hAnsi="Berlin Sans FB Demi"/>
+        </w:rPr>
+        <w:t>When you start building, use AI as your pair programmer. Instead of asking it to "build a subscription app," ask it to build specific, modular components.</w:t>
+      </w:r>
+    </w:p>
+    <w:p>
+      <w:pPr>
+        <w:pStyle w:val="NormalWeb"/>
+        <w:rPr>
+          <w:rFonts w:ascii="Berlin Sans FB Demi" w:hAnsi="Berlin Sans FB Demi"/>
+        </w:rPr>
+      </w:pPr>
+      <w:r>
+        <w:rPr>
+          <w:rFonts w:ascii="Berlin Sans FB Demi" w:hAnsi="Berlin Sans FB Demi"/>
           <w:b/>
           <w:bCs/>
         </w:rPr>
@@ -2009,28 +2029,13 @@
           <w:b/>
           <w:bCs/>
         </w:rPr>
-        <w:lastRenderedPageBreak/>
         <w:t>For Database:</w:t>
       </w:r>
       <w:r>
         <w:rPr>
           <w:rFonts w:ascii="Berlin Sans FB Demi" w:hAnsi="Berlin Sans FB Demi"/>
         </w:rPr>
-        <w:t xml:space="preserve"> "I am using </w:t>
-      </w:r>
-      <w:proofErr w:type="spellStart"/>
-      <w:r>
-        <w:rPr>
-          <w:rFonts w:ascii="Berlin Sans FB Demi" w:hAnsi="Berlin Sans FB Demi"/>
-        </w:rPr>
-        <w:t>Kotlin</w:t>
-      </w:r>
-      <w:proofErr w:type="spellEnd"/>
-      <w:r>
-        <w:rPr>
-          <w:rFonts w:ascii="Berlin Sans FB Demi" w:hAnsi="Berlin Sans FB Demi"/>
-        </w:rPr>
-        <w:t xml:space="preserve"> and Room Database. Write the Entity data class for a Subscription that includes name, cost, billing cycle, and next payment date."</w:t>
+        <w:t xml:space="preserve"> "I am using Kotlin and Room Database. Write the Entity data class for a Subscription that includes name, cost, billing cycle, and next payment date."</w:t>
       </w:r>
     </w:p>
     <w:p>
@@ -2102,7 +2107,7 @@
 </file>
 
 <file path=word/numbering.xml><?xml version="1.0" encoding="utf-8"?>
-<w:numbering xmlns:wpc="http://schemas.microsoft.com/office/word/2010/wordprocessingCanvas" xmlns:cx="http://schemas.microsoft.com/office/drawing/2014/chartex" xmlns:mc="http://schemas.openxmlformats.org/markup-compatibility/2006" xmlns:o="urn:schemas-microsoft-com:office:office" xmlns:r="http://schemas.openxmlformats.org/officeDocument/2006/relationships" xmlns:m="http://schemas.openxmlformats.org/officeDocument/2006/math" xmlns:v="urn:schemas-microsoft-com:vml" xmlns:wp14="http://schemas.microsoft.com/office/word/2010/wordprocessingDrawing" xmlns:wp="http://schemas.openxmlformats.org/drawingml/2006/wordprocessingDrawing" xmlns:w10="urn:schemas-microsoft-com:office:word" xmlns:w="http://schemas.openxmlformats.org/wordprocessingml/2006/main" xmlns:w14="http://schemas.microsoft.com/office/word/2010/wordml" xmlns:w15="http://schemas.microsoft.com/office/word/2012/wordml" xmlns:w16se="http://schemas.microsoft.com/office/word/2015/wordml/symex" xmlns:wpg="http://schemas.microsoft.com/office/word/2010/wordprocessingGroup" xmlns:wpi="http://schemas.microsoft.com/office/word/2010/wordprocessingInk" xmlns:wne="http://schemas.microsoft.com/office/word/2006/wordml" xmlns:wps="http://schemas.microsoft.com/office/word/2010/wordprocessingShape" mc:Ignorable="w14 w15 w16se wp14">
+<w:numbering xmlns:wpc="http://schemas.microsoft.com/office/word/2010/wordprocessingCanvas" xmlns:cx="http://schemas.microsoft.com/office/drawing/2014/chartex" xmlns:cx1="http://schemas.microsoft.com/office/drawing/2015/9/8/chartex" xmlns:cx2="http://schemas.microsoft.com/office/drawing/2015/10/21/chartex" xmlns:cx3="http://schemas.microsoft.com/office/drawing/2016/5/9/chartex" xmlns:cx4="http://schemas.microsoft.com/office/drawing/2016/5/10/chartex" xmlns:cx5="http://schemas.microsoft.com/office/drawing/2016/5/11/chartex" xmlns:cx6="http://schemas.microsoft.com/office/drawing/2016/5/12/chartex" xmlns:cx7="http://schemas.microsoft.com/office/drawing/2016/5/13/chartex" xmlns:cx8="http://schemas.microsoft.com/office/drawing/2016/5/14/chartex" xmlns:mc="http://schemas.openxmlformats.org/markup-compatibility/2006" xmlns:aink="http://schemas.microsoft.com/office/drawing/2016/ink" xmlns:am3d="http://schemas.microsoft.com/office/drawing/2017/model3d" xmlns:o="urn:schemas-microsoft-com:office:office" xmlns:oel="http://schemas.microsoft.com/office/2019/extlst" xmlns:r="http://schemas.openxmlformats.org/officeDocument/2006/relationships" xmlns:m="http://schemas.openxmlformats.org/officeDocument/2006/math" xmlns:v="urn:schemas-microsoft-com:vml" xmlns:wp14="http://schemas.microsoft.com/office/word/2010/wordprocessingDrawing" xmlns:wp="http://schemas.openxmlformats.org/drawingml/2006/wordprocessingDrawing" xmlns:w10="urn:schemas-microsoft-com:office:word" xmlns:w="http://schemas.openxmlformats.org/wordprocessingml/2006/main" xmlns:w14="http://schemas.microsoft.com/office/word/2010/wordml" xmlns:w15="http://schemas.microsoft.com/office/word/2012/wordml" xmlns:w16cei="http://schemas.microsoft.com/office/word/2026/wordml/cei" xmlns:w16cex="http://schemas.microsoft.com/office/word/2018/wordml/cex" xmlns:w16cid="http://schemas.microsoft.com/office/word/2016/wordml/cid" xmlns:w16="http://schemas.microsoft.com/office/word/2018/wordml" xmlns:w16du="http://schemas.microsoft.com/office/word/2023/wordml/word16du" xmlns:w16sdtdh="http://schemas.microsoft.com/office/word/2020/wordml/sdtdatahash" xmlns:w16sdtfl="http://schemas.microsoft.com/office/word/2024/wordml/sdtformatlock" xmlns:w16se="http://schemas.microsoft.com/office/word/2015/wordml/symex" xmlns:wpg="http://schemas.microsoft.com/office/word/2010/wordprocessingGroup" xmlns:wpi="http://schemas.microsoft.com/office/word/2010/wordprocessingInk" xmlns:wne="http://schemas.microsoft.com/office/word/2006/wordml" xmlns:wps="http://schemas.microsoft.com/office/word/2010/wordprocessingShape" mc:Ignorable="w14 w15 w16se w16cid w16 w16cex w16sdtdh w16sdtfl w16du wp14">
   <w:abstractNum w:abstractNumId="0" w15:restartNumberingAfterBreak="0">
     <w:nsid w:val="0026712C"/>
     <w:multiLevelType w:val="multilevel"/>
@@ -3887,47 +3892,47 @@
       </w:rPr>
     </w:lvl>
   </w:abstractNum>
-  <w:num w:numId="1">
+  <w:num w:numId="1" w16cid:durableId="1299143825">
     <w:abstractNumId w:val="7"/>
   </w:num>
-  <w:num w:numId="2">
+  <w:num w:numId="2" w16cid:durableId="1087923151">
     <w:abstractNumId w:val="5"/>
   </w:num>
-  <w:num w:numId="3">
+  <w:num w:numId="3" w16cid:durableId="429929741">
     <w:abstractNumId w:val="8"/>
   </w:num>
-  <w:num w:numId="4">
+  <w:num w:numId="4" w16cid:durableId="1228145546">
     <w:abstractNumId w:val="4"/>
   </w:num>
-  <w:num w:numId="5">
+  <w:num w:numId="5" w16cid:durableId="1047342858">
     <w:abstractNumId w:val="3"/>
   </w:num>
-  <w:num w:numId="6">
+  <w:num w:numId="6" w16cid:durableId="276453690">
     <w:abstractNumId w:val="11"/>
   </w:num>
-  <w:num w:numId="7">
+  <w:num w:numId="7" w16cid:durableId="48067980">
     <w:abstractNumId w:val="1"/>
   </w:num>
-  <w:num w:numId="8">
+  <w:num w:numId="8" w16cid:durableId="1481388270">
     <w:abstractNumId w:val="2"/>
   </w:num>
-  <w:num w:numId="9">
+  <w:num w:numId="9" w16cid:durableId="1602565182">
     <w:abstractNumId w:val="9"/>
   </w:num>
-  <w:num w:numId="10">
+  <w:num w:numId="10" w16cid:durableId="1730835957">
     <w:abstractNumId w:val="10"/>
   </w:num>
-  <w:num w:numId="11">
+  <w:num w:numId="11" w16cid:durableId="1265504496">
     <w:abstractNumId w:val="6"/>
   </w:num>
-  <w:num w:numId="12">
+  <w:num w:numId="12" w16cid:durableId="807746261">
     <w:abstractNumId w:val="0"/>
   </w:num>
 </w:numbering>
 </file>
 
 <file path=word/styles.xml><?xml version="1.0" encoding="utf-8"?>
-<w:styles xmlns:mc="http://schemas.openxmlformats.org/markup-compatibility/2006" xmlns:r="http://schemas.openxmlformats.org/officeDocument/2006/relationships" xmlns:w="http://schemas.openxmlformats.org/wordprocessingml/2006/main" xmlns:w14="http://schemas.microsoft.com/office/word/2010/wordml" xmlns:w15="http://schemas.microsoft.com/office/word/2012/wordml" xmlns:w16se="http://schemas.microsoft.com/office/word/2015/wordml/symex" mc:Ignorable="w14 w15 w16se">
+<w:styles xmlns:mc="http://schemas.openxmlformats.org/markup-compatibility/2006" xmlns:r="http://schemas.openxmlformats.org/officeDocument/2006/relationships" xmlns:w="http://schemas.openxmlformats.org/wordprocessingml/2006/main" xmlns:w14="http://schemas.microsoft.com/office/word/2010/wordml" xmlns:w15="http://schemas.microsoft.com/office/word/2012/wordml" xmlns:w16cex="http://schemas.microsoft.com/office/word/2018/wordml/cex" xmlns:w16cid="http://schemas.microsoft.com/office/word/2016/wordml/cid" xmlns:w16="http://schemas.microsoft.com/office/word/2018/wordml" xmlns:w16du="http://schemas.microsoft.com/office/word/2023/wordml/word16du" xmlns:w16sdtdh="http://schemas.microsoft.com/office/word/2020/wordml/sdtdatahash" xmlns:w16sdtfl="http://schemas.microsoft.com/office/word/2024/wordml/sdtformatlock" xmlns:w16se="http://schemas.microsoft.com/office/word/2015/wordml/symex" mc:Ignorable="w14 w15 w16se w16cid w16 w16cex w16sdtdh w16sdtfl w16du">
   <w:docDefaults>
     <w:rPrDefault>
       <w:rPr>
@@ -3941,7 +3946,7 @@
       </w:pPr>
     </w:pPrDefault>
   </w:docDefaults>
-  <w:latentStyles w:defLockedState="0" w:defUIPriority="99" w:defSemiHidden="0" w:defUnhideWhenUsed="0" w:defQFormat="0" w:count="371">
+  <w:latentStyles w:defLockedState="0" w:defUIPriority="99" w:defSemiHidden="0" w:defUnhideWhenUsed="0" w:defQFormat="0" w:count="376">
     <w:lsdException w:name="Normal" w:uiPriority="0" w:qFormat="1"/>
     <w:lsdException w:name="heading 1" w:uiPriority="9" w:qFormat="1"/>
     <w:lsdException w:name="heading 2" w:semiHidden="1" w:uiPriority="9" w:unhideWhenUsed="1" w:qFormat="1"/>
@@ -4313,6 +4318,11 @@
     <w:lsdException w:name="List Table 5 Dark Accent 6" w:uiPriority="50"/>
     <w:lsdException w:name="List Table 6 Colorful Accent 6" w:uiPriority="51"/>
     <w:lsdException w:name="List Table 7 Colorful Accent 6" w:uiPriority="52"/>
+    <w:lsdException w:name="Mention" w:semiHidden="1" w:unhideWhenUsed="1"/>
+    <w:lsdException w:name="Smart Hyperlink" w:semiHidden="1" w:unhideWhenUsed="1"/>
+    <w:lsdException w:name="Hashtag" w:semiHidden="1" w:unhideWhenUsed="1"/>
+    <w:lsdException w:name="Unresolved Mention" w:semiHidden="1" w:unhideWhenUsed="1"/>
+    <w:lsdException w:name="Smart Link" w:semiHidden="1" w:unhideWhenUsed="1"/>
   </w:latentStyles>
   <w:style w:type="paragraph" w:default="1" w:styleId="Normal">
     <w:name w:val="Normal"/>

</xml_diff>